<commit_message>
IEEE Access manuscript, post-hoc weight sensitivity, testbed record and methodology figures
paper/draft_ieee/ and paper/build_ieee.py produce paper/ieee/manuscript_ieee.docx and .pdf:
new structure (problem statement, testbed and methodology with Pumba command lines and
Algorithm 1, condensed deviations with the full table in the Appendix), third person, IEEE
captions and numeric citations. analysis/final/weight_sensitivity.py (post hoc, run after
the confirmatory results; no triplet adopted) evaluates all 231 weight triplets.
tools/record_testbed.py and data/environment/ record the testbed; new figures show the
pipeline, the deployment and the observed service graphs. Ledger sections 12-14 added.
The PeerJ build is unchanged apart from regenerated outputs.

Co-Authored-By: Claude Opus 5.5 <noreply@anthropic.com>
</commit_message>
<xml_diff>
--- a/paper/submission/Table 7.docx
+++ b/paper/submission/Table 7.docx
@@ -10,7 +10,7 @@
         <w:t xml:space="preserve">Table 7. </w:t>
       </w:r>
       <w:r>
-        <w:t>H1b: hybrid_criticality vs ancestor_affected_count in all four architecture-by-fault cells</w:t>
+        <w:t>hybrid_criticality vs ancestor_affected_count in all four architecture-by-fault cells (the preregistration's H1b)</w:t>
       </w:r>
     </w:p>
     <w:tbl>
@@ -20,23 +20,22 @@
         <w:tblLook w:firstColumn="1" w:firstRow="1" w:lastColumn="0" w:lastRow="0" w:noHBand="0" w:noVBand="1" w:val="04A0"/>
       </w:tblPr>
       <w:tblGrid>
-        <w:gridCol w:w="1084"/>
-        <w:gridCol w:w="1084"/>
-        <w:gridCol w:w="1084"/>
-        <w:gridCol w:w="1084"/>
-        <w:gridCol w:w="1084"/>
-        <w:gridCol w:w="1084"/>
-        <w:gridCol w:w="1084"/>
-        <w:gridCol w:w="1084"/>
-        <w:gridCol w:w="1084"/>
-        <w:gridCol w:w="1084"/>
-        <w:gridCol w:w="1084"/>
-        <w:gridCol w:w="1084"/>
+        <w:gridCol w:w="1182"/>
+        <w:gridCol w:w="1182"/>
+        <w:gridCol w:w="1182"/>
+        <w:gridCol w:w="1182"/>
+        <w:gridCol w:w="1182"/>
+        <w:gridCol w:w="1182"/>
+        <w:gridCol w:w="1182"/>
+        <w:gridCol w:w="1182"/>
+        <w:gridCol w:w="1182"/>
+        <w:gridCol w:w="1182"/>
+        <w:gridCol w:w="1182"/>
       </w:tblGrid>
       <w:tr>
         <w:tc>
           <w:tcPr>
-            <w:tcW w:type="dxa" w:w="1084"/>
+            <w:tcW w:type="dxa" w:w="1182"/>
           </w:tcPr>
           <w:p>
             <w:pPr>
@@ -54,7 +53,7 @@
         </w:tc>
         <w:tc>
           <w:tcPr>
-            <w:tcW w:type="dxa" w:w="1084"/>
+            <w:tcW w:type="dxa" w:w="1182"/>
           </w:tcPr>
           <w:p>
             <w:pPr>
@@ -72,7 +71,7 @@
         </w:tc>
         <w:tc>
           <w:tcPr>
-            <w:tcW w:type="dxa" w:w="1084"/>
+            <w:tcW w:type="dxa" w:w="1182"/>
           </w:tcPr>
           <w:p>
             <w:pPr>
@@ -90,7 +89,7 @@
         </w:tc>
         <w:tc>
           <w:tcPr>
-            <w:tcW w:type="dxa" w:w="1084"/>
+            <w:tcW w:type="dxa" w:w="1182"/>
           </w:tcPr>
           <w:p>
             <w:pPr>
@@ -108,7 +107,7 @@
         </w:tc>
         <w:tc>
           <w:tcPr>
-            <w:tcW w:type="dxa" w:w="1084"/>
+            <w:tcW w:type="dxa" w:w="1182"/>
           </w:tcPr>
           <w:p>
             <w:pPr>
@@ -126,7 +125,7 @@
         </w:tc>
         <w:tc>
           <w:tcPr>
-            <w:tcW w:type="dxa" w:w="1084"/>
+            <w:tcW w:type="dxa" w:w="1182"/>
           </w:tcPr>
           <w:p>
             <w:pPr>
@@ -144,7 +143,7 @@
         </w:tc>
         <w:tc>
           <w:tcPr>
-            <w:tcW w:type="dxa" w:w="1084"/>
+            <w:tcW w:type="dxa" w:w="1182"/>
           </w:tcPr>
           <w:p>
             <w:pPr>
@@ -162,7 +161,7 @@
         </w:tc>
         <w:tc>
           <w:tcPr>
-            <w:tcW w:type="dxa" w:w="1084"/>
+            <w:tcW w:type="dxa" w:w="1182"/>
           </w:tcPr>
           <w:p>
             <w:pPr>
@@ -180,7 +179,7 @@
         </w:tc>
         <w:tc>
           <w:tcPr>
-            <w:tcW w:type="dxa" w:w="1084"/>
+            <w:tcW w:type="dxa" w:w="1182"/>
           </w:tcPr>
           <w:p>
             <w:pPr>
@@ -198,7 +197,7 @@
         </w:tc>
         <w:tc>
           <w:tcPr>
-            <w:tcW w:type="dxa" w:w="1084"/>
+            <w:tcW w:type="dxa" w:w="1182"/>
           </w:tcPr>
           <w:p>
             <w:pPr>
@@ -216,7 +215,7 @@
         </w:tc>
         <w:tc>
           <w:tcPr>
-            <w:tcW w:type="dxa" w:w="1084"/>
+            <w:tcW w:type="dxa" w:w="1182"/>
           </w:tcPr>
           <w:p>
             <w:pPr>
@@ -232,29 +231,11 @@
             </w:r>
           </w:p>
         </w:tc>
-        <w:tc>
-          <w:tcPr>
-            <w:tcW w:type="dxa" w:w="1084"/>
-          </w:tcPr>
-          <w:p>
-            <w:pPr>
-              <w:spacing w:line="240" w:lineRule="auto"/>
-            </w:pPr>
-            <w:r/>
-            <w:r>
-              <w:rPr>
-                <w:b/>
-                <w:sz w:val="18"/>
-              </w:rPr>
-              <w:t>verdict</w:t>
-            </w:r>
-          </w:p>
-        </w:tc>
       </w:tr>
       <w:tr>
         <w:tc>
           <w:tcPr>
-            <w:tcW w:type="dxa" w:w="1084"/>
+            <w:tcW w:type="dxa" w:w="1182"/>
           </w:tcPr>
           <w:p>
             <w:pPr>
@@ -272,7 +253,7 @@
         </w:tc>
         <w:tc>
           <w:tcPr>
-            <w:tcW w:type="dxa" w:w="1084"/>
+            <w:tcW w:type="dxa" w:w="1182"/>
           </w:tcPr>
           <w:p>
             <w:pPr>
@@ -290,7 +271,7 @@
         </w:tc>
         <w:tc>
           <w:tcPr>
-            <w:tcW w:type="dxa" w:w="1084"/>
+            <w:tcW w:type="dxa" w:w="1182"/>
           </w:tcPr>
           <w:p>
             <w:pPr>
@@ -308,7 +289,7 @@
         </w:tc>
         <w:tc>
           <w:tcPr>
-            <w:tcW w:type="dxa" w:w="1084"/>
+            <w:tcW w:type="dxa" w:w="1182"/>
           </w:tcPr>
           <w:p>
             <w:pPr>
@@ -326,7 +307,7 @@
         </w:tc>
         <w:tc>
           <w:tcPr>
-            <w:tcW w:type="dxa" w:w="1084"/>
+            <w:tcW w:type="dxa" w:w="1182"/>
           </w:tcPr>
           <w:p>
             <w:pPr>
@@ -344,7 +325,7 @@
         </w:tc>
         <w:tc>
           <w:tcPr>
-            <w:tcW w:type="dxa" w:w="1084"/>
+            <w:tcW w:type="dxa" w:w="1182"/>
           </w:tcPr>
           <w:p>
             <w:pPr>
@@ -362,7 +343,7 @@
         </w:tc>
         <w:tc>
           <w:tcPr>
-            <w:tcW w:type="dxa" w:w="1084"/>
+            <w:tcW w:type="dxa" w:w="1182"/>
           </w:tcPr>
           <w:p>
             <w:pPr>
@@ -380,7 +361,7 @@
         </w:tc>
         <w:tc>
           <w:tcPr>
-            <w:tcW w:type="dxa" w:w="1084"/>
+            <w:tcW w:type="dxa" w:w="1182"/>
           </w:tcPr>
           <w:p>
             <w:pPr>
@@ -398,7 +379,7 @@
         </w:tc>
         <w:tc>
           <w:tcPr>
-            <w:tcW w:type="dxa" w:w="1084"/>
+            <w:tcW w:type="dxa" w:w="1182"/>
           </w:tcPr>
           <w:p>
             <w:pPr>
@@ -416,7 +397,7 @@
         </w:tc>
         <w:tc>
           <w:tcPr>
-            <w:tcW w:type="dxa" w:w="1084"/>
+            <w:tcW w:type="dxa" w:w="1182"/>
           </w:tcPr>
           <w:p>
             <w:pPr>
@@ -434,7 +415,7 @@
         </w:tc>
         <w:tc>
           <w:tcPr>
-            <w:tcW w:type="dxa" w:w="1084"/>
+            <w:tcW w:type="dxa" w:w="1182"/>
           </w:tcPr>
           <w:p>
             <w:pPr>
@@ -450,29 +431,11 @@
             </w:r>
           </w:p>
         </w:tc>
-        <w:tc>
-          <w:tcPr>
-            <w:tcW w:type="dxa" w:w="1084"/>
-          </w:tcPr>
-          <w:p>
-            <w:pPr>
-              <w:spacing w:line="240" w:lineRule="auto"/>
-            </w:pPr>
-            <w:r/>
-            <w:r>
-              <w:rPr>
-                <w:b w:val="0"/>
-                <w:sz w:val="18"/>
-              </w:rPr>
-              <w:t>directionally anti-predictive but NOT distinguishable from zero after FDR</w:t>
-            </w:r>
-          </w:p>
-        </w:tc>
       </w:tr>
       <w:tr>
         <w:tc>
           <w:tcPr>
-            <w:tcW w:type="dxa" w:w="1084"/>
+            <w:tcW w:type="dxa" w:w="1182"/>
           </w:tcPr>
           <w:p>
             <w:pPr>
@@ -490,7 +453,7 @@
         </w:tc>
         <w:tc>
           <w:tcPr>
-            <w:tcW w:type="dxa" w:w="1084"/>
+            <w:tcW w:type="dxa" w:w="1182"/>
           </w:tcPr>
           <w:p>
             <w:pPr>
@@ -508,7 +471,7 @@
         </w:tc>
         <w:tc>
           <w:tcPr>
-            <w:tcW w:type="dxa" w:w="1084"/>
+            <w:tcW w:type="dxa" w:w="1182"/>
           </w:tcPr>
           <w:p>
             <w:pPr>
@@ -526,7 +489,7 @@
         </w:tc>
         <w:tc>
           <w:tcPr>
-            <w:tcW w:type="dxa" w:w="1084"/>
+            <w:tcW w:type="dxa" w:w="1182"/>
           </w:tcPr>
           <w:p>
             <w:pPr>
@@ -544,7 +507,7 @@
         </w:tc>
         <w:tc>
           <w:tcPr>
-            <w:tcW w:type="dxa" w:w="1084"/>
+            <w:tcW w:type="dxa" w:w="1182"/>
           </w:tcPr>
           <w:p>
             <w:pPr>
@@ -562,7 +525,7 @@
         </w:tc>
         <w:tc>
           <w:tcPr>
-            <w:tcW w:type="dxa" w:w="1084"/>
+            <w:tcW w:type="dxa" w:w="1182"/>
           </w:tcPr>
           <w:p>
             <w:pPr>
@@ -580,7 +543,7 @@
         </w:tc>
         <w:tc>
           <w:tcPr>
-            <w:tcW w:type="dxa" w:w="1084"/>
+            <w:tcW w:type="dxa" w:w="1182"/>
           </w:tcPr>
           <w:p>
             <w:pPr>
@@ -598,7 +561,7 @@
         </w:tc>
         <w:tc>
           <w:tcPr>
-            <w:tcW w:type="dxa" w:w="1084"/>
+            <w:tcW w:type="dxa" w:w="1182"/>
           </w:tcPr>
           <w:p>
             <w:pPr>
@@ -616,7 +579,7 @@
         </w:tc>
         <w:tc>
           <w:tcPr>
-            <w:tcW w:type="dxa" w:w="1084"/>
+            <w:tcW w:type="dxa" w:w="1182"/>
           </w:tcPr>
           <w:p>
             <w:pPr>
@@ -634,7 +597,7 @@
         </w:tc>
         <w:tc>
           <w:tcPr>
-            <w:tcW w:type="dxa" w:w="1084"/>
+            <w:tcW w:type="dxa" w:w="1182"/>
           </w:tcPr>
           <w:p>
             <w:pPr>
@@ -652,7 +615,7 @@
         </w:tc>
         <w:tc>
           <w:tcPr>
-            <w:tcW w:type="dxa" w:w="1084"/>
+            <w:tcW w:type="dxa" w:w="1182"/>
           </w:tcPr>
           <w:p>
             <w:pPr>
@@ -668,29 +631,11 @@
             </w:r>
           </w:p>
         </w:tc>
-        <w:tc>
-          <w:tcPr>
-            <w:tcW w:type="dxa" w:w="1084"/>
-          </w:tcPr>
-          <w:p>
-            <w:pPr>
-              <w:spacing w:line="240" w:lineRule="auto"/>
-            </w:pPr>
-            <w:r/>
-            <w:r>
-              <w:rPr>
-                <w:b w:val="0"/>
-                <w:sz w:val="18"/>
-              </w:rPr>
-              <w:t>directionally anti-predictive but NOT distinguishable from zero after FDR</w:t>
-            </w:r>
-          </w:p>
-        </w:tc>
       </w:tr>
       <w:tr>
         <w:tc>
           <w:tcPr>
-            <w:tcW w:type="dxa" w:w="1084"/>
+            <w:tcW w:type="dxa" w:w="1182"/>
           </w:tcPr>
           <w:p>
             <w:pPr>
@@ -708,7 +653,7 @@
         </w:tc>
         <w:tc>
           <w:tcPr>
-            <w:tcW w:type="dxa" w:w="1084"/>
+            <w:tcW w:type="dxa" w:w="1182"/>
           </w:tcPr>
           <w:p>
             <w:pPr>
@@ -726,7 +671,7 @@
         </w:tc>
         <w:tc>
           <w:tcPr>
-            <w:tcW w:type="dxa" w:w="1084"/>
+            <w:tcW w:type="dxa" w:w="1182"/>
           </w:tcPr>
           <w:p>
             <w:pPr>
@@ -744,7 +689,7 @@
         </w:tc>
         <w:tc>
           <w:tcPr>
-            <w:tcW w:type="dxa" w:w="1084"/>
+            <w:tcW w:type="dxa" w:w="1182"/>
           </w:tcPr>
           <w:p>
             <w:pPr>
@@ -762,7 +707,7 @@
         </w:tc>
         <w:tc>
           <w:tcPr>
-            <w:tcW w:type="dxa" w:w="1084"/>
+            <w:tcW w:type="dxa" w:w="1182"/>
           </w:tcPr>
           <w:p>
             <w:pPr>
@@ -780,7 +725,7 @@
         </w:tc>
         <w:tc>
           <w:tcPr>
-            <w:tcW w:type="dxa" w:w="1084"/>
+            <w:tcW w:type="dxa" w:w="1182"/>
           </w:tcPr>
           <w:p>
             <w:pPr>
@@ -798,7 +743,7 @@
         </w:tc>
         <w:tc>
           <w:tcPr>
-            <w:tcW w:type="dxa" w:w="1084"/>
+            <w:tcW w:type="dxa" w:w="1182"/>
           </w:tcPr>
           <w:p>
             <w:pPr>
@@ -816,7 +761,7 @@
         </w:tc>
         <w:tc>
           <w:tcPr>
-            <w:tcW w:type="dxa" w:w="1084"/>
+            <w:tcW w:type="dxa" w:w="1182"/>
           </w:tcPr>
           <w:p>
             <w:pPr>
@@ -834,7 +779,7 @@
         </w:tc>
         <w:tc>
           <w:tcPr>
-            <w:tcW w:type="dxa" w:w="1084"/>
+            <w:tcW w:type="dxa" w:w="1182"/>
           </w:tcPr>
           <w:p>
             <w:pPr>
@@ -852,7 +797,7 @@
         </w:tc>
         <w:tc>
           <w:tcPr>
-            <w:tcW w:type="dxa" w:w="1084"/>
+            <w:tcW w:type="dxa" w:w="1182"/>
           </w:tcPr>
           <w:p>
             <w:pPr>
@@ -870,7 +815,7 @@
         </w:tc>
         <w:tc>
           <w:tcPr>
-            <w:tcW w:type="dxa" w:w="1084"/>
+            <w:tcW w:type="dxa" w:w="1182"/>
           </w:tcPr>
           <w:p>
             <w:pPr>
@@ -886,29 +831,11 @@
             </w:r>
           </w:p>
         </w:tc>
-        <w:tc>
-          <w:tcPr>
-            <w:tcW w:type="dxa" w:w="1084"/>
-          </w:tcPr>
-          <w:p>
-            <w:pPr>
-              <w:spacing w:line="240" w:lineRule="auto"/>
-            </w:pPr>
-            <w:r/>
-            <w:r>
-              <w:rPr>
-                <w:b w:val="0"/>
-                <w:sz w:val="18"/>
-              </w:rPr>
-              <w:t>directionally anti-predictive but NOT distinguishable from zero after FDR</w:t>
-            </w:r>
-          </w:p>
-        </w:tc>
       </w:tr>
       <w:tr>
         <w:tc>
           <w:tcPr>
-            <w:tcW w:type="dxa" w:w="1084"/>
+            <w:tcW w:type="dxa" w:w="1182"/>
           </w:tcPr>
           <w:p>
             <w:pPr>
@@ -926,7 +853,7 @@
         </w:tc>
         <w:tc>
           <w:tcPr>
-            <w:tcW w:type="dxa" w:w="1084"/>
+            <w:tcW w:type="dxa" w:w="1182"/>
           </w:tcPr>
           <w:p>
             <w:pPr>
@@ -944,7 +871,7 @@
         </w:tc>
         <w:tc>
           <w:tcPr>
-            <w:tcW w:type="dxa" w:w="1084"/>
+            <w:tcW w:type="dxa" w:w="1182"/>
           </w:tcPr>
           <w:p>
             <w:pPr>
@@ -962,7 +889,7 @@
         </w:tc>
         <w:tc>
           <w:tcPr>
-            <w:tcW w:type="dxa" w:w="1084"/>
+            <w:tcW w:type="dxa" w:w="1182"/>
           </w:tcPr>
           <w:p>
             <w:pPr>
@@ -980,7 +907,7 @@
         </w:tc>
         <w:tc>
           <w:tcPr>
-            <w:tcW w:type="dxa" w:w="1084"/>
+            <w:tcW w:type="dxa" w:w="1182"/>
           </w:tcPr>
           <w:p>
             <w:pPr>
@@ -998,7 +925,7 @@
         </w:tc>
         <w:tc>
           <w:tcPr>
-            <w:tcW w:type="dxa" w:w="1084"/>
+            <w:tcW w:type="dxa" w:w="1182"/>
           </w:tcPr>
           <w:p>
             <w:pPr>
@@ -1016,7 +943,7 @@
         </w:tc>
         <w:tc>
           <w:tcPr>
-            <w:tcW w:type="dxa" w:w="1084"/>
+            <w:tcW w:type="dxa" w:w="1182"/>
           </w:tcPr>
           <w:p>
             <w:pPr>
@@ -1034,7 +961,7 @@
         </w:tc>
         <w:tc>
           <w:tcPr>
-            <w:tcW w:type="dxa" w:w="1084"/>
+            <w:tcW w:type="dxa" w:w="1182"/>
           </w:tcPr>
           <w:p>
             <w:pPr>
@@ -1052,7 +979,7 @@
         </w:tc>
         <w:tc>
           <w:tcPr>
-            <w:tcW w:type="dxa" w:w="1084"/>
+            <w:tcW w:type="dxa" w:w="1182"/>
           </w:tcPr>
           <w:p>
             <w:pPr>
@@ -1070,7 +997,7 @@
         </w:tc>
         <w:tc>
           <w:tcPr>
-            <w:tcW w:type="dxa" w:w="1084"/>
+            <w:tcW w:type="dxa" w:w="1182"/>
           </w:tcPr>
           <w:p>
             <w:pPr>
@@ -1088,7 +1015,7 @@
         </w:tc>
         <w:tc>
           <w:tcPr>
-            <w:tcW w:type="dxa" w:w="1084"/>
+            <w:tcW w:type="dxa" w:w="1182"/>
           </w:tcPr>
           <w:p>
             <w:pPr>
@@ -1101,24 +1028,6 @@
                 <w:sz w:val="18"/>
               </w:rPr>
               <w:t>no</w:t>
-            </w:r>
-          </w:p>
-        </w:tc>
-        <w:tc>
-          <w:tcPr>
-            <w:tcW w:type="dxa" w:w="1084"/>
-          </w:tcPr>
-          <w:p>
-            <w:pPr>
-              <w:spacing w:line="240" w:lineRule="auto"/>
-            </w:pPr>
-            <w:r/>
-            <w:r>
-              <w:rPr>
-                <w:b w:val="0"/>
-                <w:sz w:val="18"/>
-              </w:rPr>
-              <w:t>directionally anti-predictive but NOT distinguishable from zero after FDR</w:t>
             </w:r>
           </w:p>
         </w:tc>

</xml_diff>